<commit_message>
Week 2 - Problem 1
User can customize the first book on the list without conforming to preexisting form, and all the books added later must have the same keys
</commit_message>
<xml_diff>
--- a/Week 1/Homework.docx
+++ b/Week 1/Homework.docx
@@ -4,6 +4,19 @@
   <w:body>
     <w:p>
       <w:pPr>
+        <w:rPr>
+          <w:sz w:val="32"/>
+        </w:rPr>
+      </w:pPr>
+      <w:r>
+        <w:rPr>
+          <w:sz w:val="32"/>
+        </w:rPr>
+        <w:t>24021352 – Nguyễn Hải An</w:t>
+      </w:r>
+    </w:p>
+    <w:p>
+      <w:pPr>
         <w:pStyle w:val="ListParagraph"/>
         <w:numPr>
           <w:ilvl w:val="0"/>
@@ -25,6 +38,8 @@
         </w:rPr>
         <w:t xml:space="preserve"> API public thật viết về một domain quan tâm, và trả lời: loại nào, base URL, auth method, có versioning hay không, resource identifier là số hay UUID?</w:t>
       </w:r>
+      <w:bookmarkStart w:id="0" w:name="_GoBack"/>
+      <w:bookmarkEnd w:id="0"/>
     </w:p>
     <w:p>
       <w:pPr>
@@ -410,15 +425,7 @@
         <w:rPr>
           <w:sz w:val="28"/>
         </w:rPr>
-        <w:t>Đọc Higginbotham Ch.1 + Geewax Ch.1. Tập trung định nghĩa, resource, đặc điểm của API tốt, so sánh  với đặc điểm đã học và có đ</w:t>
-      </w:r>
-      <w:bookmarkStart w:id="0" w:name="_GoBack"/>
-      <w:bookmarkEnd w:id="0"/>
-      <w:r>
-        <w:rPr>
-          <w:sz w:val="28"/>
-        </w:rPr>
-        <w:t>iểm nào được bổ sung.</w:t>
+        <w:t>Đọc Higginbotham Ch.1 + Geewax Ch.1. Tập trung định nghĩa, resource, đặc điểm của API tốt, so sánh  với đặc điểm đã học và có điểm nào được bổ sung.</w:t>
       </w:r>
     </w:p>
     <w:p>

</xml_diff>